<commit_message>
Update Bible translation questions and resources for multiple languages for 2026-06-29 release
</commit_message>
<xml_diff>
--- a/arb/docx/42.content.docx
+++ b/arb/docx/42.content.docx
@@ -8136,7 +8136,7 @@
         <w:rPr>
           <w:lang w:val="ar_AE" w:bidi="ar_AE"/>
         </w:rPr>
-        <w:t>لوقا 6: 47</w:t>
+        <w:t>لوقا 6: 47–48</w:t>
       </w:r>
       <w:r>
         <w:rPr>
@@ -14998,7 +14998,7 @@
         <w:rPr>
           <w:lang w:val="ar_AE" w:bidi="ar_AE"/>
         </w:rPr>
-        <w:t>لوقا 13: 28 (#2)</w:t>
+        <w:t>لوقا 13: 28–29 (#2)</w:t>
       </w:r>
       <w:r>
         <w:rPr>

</xml_diff>